<commit_message>
Add cover image and update documentation
</commit_message>
<xml_diff>
--- a/docs/TIFF URL Viewer 10.24.17.docx
+++ b/docs/TIFF URL Viewer 10.24.17.docx
@@ -34,16 +34,15 @@
     </w:p>
     <w:p>
       <w:pPr>
-        <w:keepNext/>
-        <w:spacing w:after="60" w:before="120"/>
+        <w:spacing w:after="240"/>
         <w:jc w:val="center"/>
       </w:pPr>
       <w:r>
         <w:drawing>
           <wp:inline distT="0" distB="0" distL="0" distR="0">
-            <wp:extent cx="4191000" cy="4067175"/>
+            <wp:extent cx="4191000" cy="3143250"/>
             <wp:effectExtent t="0" r="0" b="0" l="0"/>
-            <wp:docPr id="1" name="Screenshot_1.png" descr="A scanned two-page delivery note with the zoom buttons" title="A scanned two-page delivery note with the zoom buttons"/>
+            <wp:docPr id="1" name="cover" descr="TIFF URL Viewer cover" title="Cover"/>
             <wp:cNvGraphicFramePr>
               <a:graphicFrameLocks xmlns:a="http://schemas.openxmlformats.org/drawingml/2006/main" noChangeAspect="1"/>
             </wp:cNvGraphicFramePr>
@@ -66,7 +65,7 @@
                   <pic:spPr bwMode="auto">
                     <a:xfrm>
                       <a:off x="0" y="0"/>
-                      <a:ext cx="4191000" cy="4067175"/>
+                      <a:ext cx="4191000" cy="3143250"/>
                     </a:xfrm>
                     <a:prstGeom prst="rect">
                       <a:avLst/>
@@ -77,22 +76,6 @@
             </a:graphic>
           </wp:inline>
         </w:drawing>
-      </w:r>
-    </w:p>
-    <w:p>
-      <w:pPr>
-        <w:spacing w:after="200"/>
-        <w:jc w:val="center"/>
-      </w:pPr>
-      <w:r>
-        <w:rPr>
-          <w:i/>
-          <w:iCs/>
-          <w:color w:val="595959"/>
-          <w:sz w:val="18"/>
-          <w:szCs w:val="18"/>
-        </w:rPr>
-        <w:t xml:space="preserve">Figure 1. A scanned two-page delivery note with the zoom buttons</w:t>
       </w:r>
     </w:p>
     <w:tbl>
@@ -3080,69 +3063,6 @@
             <wp:extent cx="4953000" cy="4810125"/>
             <wp:effectExtent t="0" r="0" b="0" l="0"/>
             <wp:docPr id="2" name="Screenshot_1.png" descr="Width 640, height 620, zoom controls on: the first page fits the box" title="Width 640, height 620, zoom controls on: the first page fits the box"/>
-            <wp:cNvGraphicFramePr>
-              <a:graphicFrameLocks xmlns:a="http://schemas.openxmlformats.org/drawingml/2006/main" noChangeAspect="1"/>
-            </wp:cNvGraphicFramePr>
-            <a:graphic xmlns:a="http://schemas.openxmlformats.org/drawingml/2006/main">
-              <a:graphicData uri="http://schemas.openxmlformats.org/drawingml/2006/picture">
-                <pic:pic xmlns:pic="http://schemas.openxmlformats.org/drawingml/2006/picture">
-                  <pic:nvPicPr>
-                    <pic:cNvPr id="0" name="" descr=""/>
-                    <pic:cNvPicPr>
-                      <a:picLocks noChangeAspect="1" noChangeArrowheads="1"/>
-                    </pic:cNvPicPr>
-                  </pic:nvPicPr>
-                  <pic:blipFill>
-                    <a:blip r:embed="rId9" cstate="none"/>
-                    <a:srcRect/>
-                    <a:stretch>
-                      <a:fillRect/>
-                    </a:stretch>
-                  </pic:blipFill>
-                  <pic:spPr bwMode="auto">
-                    <a:xfrm>
-                      <a:off x="0" y="0"/>
-                      <a:ext cx="4953000" cy="4810125"/>
-                    </a:xfrm>
-                    <a:prstGeom prst="rect">
-                      <a:avLst/>
-                    </a:prstGeom>
-                  </pic:spPr>
-                </pic:pic>
-              </a:graphicData>
-            </a:graphic>
-          </wp:inline>
-        </w:drawing>
-      </w:r>
-    </w:p>
-    <w:p>
-      <w:pPr>
-        <w:spacing w:after="200"/>
-        <w:jc w:val="center"/>
-      </w:pPr>
-      <w:r>
-        <w:rPr>
-          <w:i/>
-          <w:iCs/>
-          <w:color w:val="595959"/>
-          <w:sz w:val="18"/>
-          <w:szCs w:val="18"/>
-        </w:rPr>
-        <w:t xml:space="preserve">Figure 2. Width 640, height 620, zoom controls on: the first page fits the box</w:t>
-      </w:r>
-    </w:p>
-    <w:p>
-      <w:pPr>
-        <w:keepNext/>
-        <w:spacing w:after="60" w:before="120"/>
-        <w:jc w:val="center"/>
-      </w:pPr>
-      <w:r>
-        <w:drawing>
-          <wp:inline distT="0" distB="0" distL="0" distR="0">
-            <wp:extent cx="4953000" cy="3067050"/>
-            <wp:effectExtent t="0" r="0" b="0" l="0"/>
-            <wp:docPr id="3" name="Screenshot_2.png" descr="Width 100%, height 640, zoom controls off" title="Width 100%, height 640, zoom controls off"/>
             <wp:cNvGraphicFramePr>
               <a:graphicFrameLocks xmlns:a="http://schemas.openxmlformats.org/drawingml/2006/main" noChangeAspect="1"/>
             </wp:cNvGraphicFramePr>
@@ -3165,7 +3085,7 @@
                   <pic:spPr bwMode="auto">
                     <a:xfrm>
                       <a:off x="0" y="0"/>
-                      <a:ext cx="4953000" cy="3067050"/>
+                      <a:ext cx="4953000" cy="4810125"/>
                     </a:xfrm>
                     <a:prstGeom prst="rect">
                       <a:avLst/>
@@ -3191,7 +3111,7 @@
           <w:sz w:val="18"/>
           <w:szCs w:val="18"/>
         </w:rPr>
-        <w:t xml:space="preserve">Figure 3. Width 100%, height 640, zoom controls off</w:t>
+        <w:t xml:space="preserve">Figure 1. Width 640, height 620, zoom controls on: the first page fits the box</w:t>
       </w:r>
     </w:p>
     <w:p>
@@ -3203,9 +3123,9 @@
       <w:r>
         <w:drawing>
           <wp:inline distT="0" distB="0" distL="0" distR="0">
-            <wp:extent cx="4953000" cy="4810125"/>
+            <wp:extent cx="4953000" cy="3067050"/>
             <wp:effectExtent t="0" r="0" b="0" l="0"/>
-            <wp:docPr id="4" name="Screenshot_3.png" descr="After Zoom in four times: the box scrolls and the toolbar stays in place" title="After Zoom in four times: the box scrolls and the toolbar stays in place"/>
+            <wp:docPr id="3" name="Screenshot_2.png" descr="Width 100%, height 640, zoom controls off" title="Width 100%, height 640, zoom controls off"/>
             <wp:cNvGraphicFramePr>
               <a:graphicFrameLocks xmlns:a="http://schemas.openxmlformats.org/drawingml/2006/main" noChangeAspect="1"/>
             </wp:cNvGraphicFramePr>
@@ -3228,7 +3148,7 @@
                   <pic:spPr bwMode="auto">
                     <a:xfrm>
                       <a:off x="0" y="0"/>
-                      <a:ext cx="4953000" cy="4810125"/>
+                      <a:ext cx="4953000" cy="3067050"/>
                     </a:xfrm>
                     <a:prstGeom prst="rect">
                       <a:avLst/>
@@ -3254,7 +3174,7 @@
           <w:sz w:val="18"/>
           <w:szCs w:val="18"/>
         </w:rPr>
-        <w:t xml:space="preserve">Figure 4. After Zoom in four times: the box scrolls and the toolbar stays in place</w:t>
+        <w:t xml:space="preserve">Figure 2. Width 100%, height 640, zoom controls off</w:t>
       </w:r>
     </w:p>
     <w:p>
@@ -3266,9 +3186,9 @@
       <w:r>
         <w:drawing>
           <wp:inline distT="0" distB="0" distL="0" distR="0">
-            <wp:extent cx="4953000" cy="1714500"/>
+            <wp:extent cx="4953000" cy="4810125"/>
             <wp:effectExtent t="0" r="0" b="0" l="0"/>
-            <wp:docPr id="5" name="Screenshot_4.png" descr="A file that is not a TIFF image shows an error message" title="A file that is not a TIFF image shows an error message"/>
+            <wp:docPr id="4" name="Screenshot_3.png" descr="After Zoom in four times: the box scrolls and the toolbar stays in place" title="After Zoom in four times: the box scrolls and the toolbar stays in place"/>
             <wp:cNvGraphicFramePr>
               <a:graphicFrameLocks xmlns:a="http://schemas.openxmlformats.org/drawingml/2006/main" noChangeAspect="1"/>
             </wp:cNvGraphicFramePr>
@@ -3291,7 +3211,7 @@
                   <pic:spPr bwMode="auto">
                     <a:xfrm>
                       <a:off x="0" y="0"/>
-                      <a:ext cx="4953000" cy="1714500"/>
+                      <a:ext cx="4953000" cy="4810125"/>
                     </a:xfrm>
                     <a:prstGeom prst="rect">
                       <a:avLst/>
@@ -3317,7 +3237,7 @@
           <w:sz w:val="18"/>
           <w:szCs w:val="18"/>
         </w:rPr>
-        <w:t xml:space="preserve">Figure 5. A file that is not a TIFF image shows an error message</w:t>
+        <w:t xml:space="preserve">Figure 3. After Zoom in four times: the box scrolls and the toolbar stays in place</w:t>
       </w:r>
     </w:p>
     <w:p>
@@ -3329,9 +3249,9 @@
       <w:r>
         <w:drawing>
           <wp:inline distT="0" distB="0" distL="0" distR="0">
-            <wp:extent cx="2095500" cy="3105150"/>
+            <wp:extent cx="4953000" cy="1714500"/>
             <wp:effectExtent t="0" r="0" b="0" l="0"/>
-            <wp:docPr id="6" name="Screenshot_5.png" descr="Phone width with width 100% and height 70vh" title="Phone width with width 100% and height 70vh"/>
+            <wp:docPr id="5" name="Screenshot_4.png" descr="A file that is not a TIFF image shows an error message" title="A file that is not a TIFF image shows an error message"/>
             <wp:cNvGraphicFramePr>
               <a:graphicFrameLocks xmlns:a="http://schemas.openxmlformats.org/drawingml/2006/main" noChangeAspect="1"/>
             </wp:cNvGraphicFramePr>
@@ -3354,6 +3274,69 @@
                   <pic:spPr bwMode="auto">
                     <a:xfrm>
                       <a:off x="0" y="0"/>
+                      <a:ext cx="4953000" cy="1714500"/>
+                    </a:xfrm>
+                    <a:prstGeom prst="rect">
+                      <a:avLst/>
+                    </a:prstGeom>
+                  </pic:spPr>
+                </pic:pic>
+              </a:graphicData>
+            </a:graphic>
+          </wp:inline>
+        </w:drawing>
+      </w:r>
+    </w:p>
+    <w:p>
+      <w:pPr>
+        <w:spacing w:after="200"/>
+        <w:jc w:val="center"/>
+      </w:pPr>
+      <w:r>
+        <w:rPr>
+          <w:i/>
+          <w:iCs/>
+          <w:color w:val="595959"/>
+          <w:sz w:val="18"/>
+          <w:szCs w:val="18"/>
+        </w:rPr>
+        <w:t xml:space="preserve">Figure 4. A file that is not a TIFF image shows an error message</w:t>
+      </w:r>
+    </w:p>
+    <w:p>
+      <w:pPr>
+        <w:keepNext/>
+        <w:spacing w:after="60" w:before="120"/>
+        <w:jc w:val="center"/>
+      </w:pPr>
+      <w:r>
+        <w:drawing>
+          <wp:inline distT="0" distB="0" distL="0" distR="0">
+            <wp:extent cx="2095500" cy="3105150"/>
+            <wp:effectExtent t="0" r="0" b="0" l="0"/>
+            <wp:docPr id="6" name="Screenshot_5.png" descr="Phone width with width 100% and height 70vh" title="Phone width with width 100% and height 70vh"/>
+            <wp:cNvGraphicFramePr>
+              <a:graphicFrameLocks xmlns:a="http://schemas.openxmlformats.org/drawingml/2006/main" noChangeAspect="1"/>
+            </wp:cNvGraphicFramePr>
+            <a:graphic xmlns:a="http://schemas.openxmlformats.org/drawingml/2006/main">
+              <a:graphicData uri="http://schemas.openxmlformats.org/drawingml/2006/picture">
+                <pic:pic xmlns:pic="http://schemas.openxmlformats.org/drawingml/2006/picture">
+                  <pic:nvPicPr>
+                    <pic:cNvPr id="0" name="" descr=""/>
+                    <pic:cNvPicPr>
+                      <a:picLocks noChangeAspect="1" noChangeArrowheads="1"/>
+                    </pic:cNvPicPr>
+                  </pic:nvPicPr>
+                  <pic:blipFill>
+                    <a:blip r:embed="rId14" cstate="none"/>
+                    <a:srcRect/>
+                    <a:stretch>
+                      <a:fillRect/>
+                    </a:stretch>
+                  </pic:blipFill>
+                  <pic:spPr bwMode="auto">
+                    <a:xfrm>
+                      <a:off x="0" y="0"/>
                       <a:ext cx="2095500" cy="3105150"/>
                     </a:xfrm>
                     <a:prstGeom prst="rect">
@@ -3380,7 +3363,7 @@
           <w:sz w:val="18"/>
           <w:szCs w:val="18"/>
         </w:rPr>
-        <w:t xml:space="preserve">Figure 6. Phone width with width 100% and height 70vh</w:t>
+        <w:t xml:space="preserve">Figure 5. Phone width with width 100% and height 70vh</w:t>
       </w:r>
     </w:p>
     <w:p>
@@ -3766,7 +3749,7 @@
       <w:pPr>
         <w:spacing w:after="120"/>
       </w:pPr>
-      <w:hyperlink w:history="1" r:id="rIdklpywdvgbzs4t6iw_smzc">
+      <w:hyperlink w:history="1" r:id="rIdoww9pmiwtx38ilfxrznqo">
         <w:r>
           <w:rPr>
             <w:rStyle w:val="Hyperlink"/>
@@ -3787,7 +3770,7 @@
       <w:pPr>
         <w:spacing w:after="120"/>
       </w:pPr>
-      <w:hyperlink w:history="1" r:id="rIdx7mnpsjidotx_f6kxo99p">
+      <w:hyperlink w:history="1" r:id="rIdlxi4lj1jw_kxb5okcd_hr">
         <w:r>
           <w:rPr>
             <w:rStyle w:val="Hyperlink"/>

</xml_diff>